<commit_message>
docs: finalize SRS SAD and test plan
</commit_message>
<xml_diff>
--- a/docs/Simple-Shell_SAD.docx
+++ b/docs/Simple-Shell_SAD.docx
@@ -3572,6 +3572,80 @@
           <w:szCs w:val="22"/>
         </w:rPr>
         <w:t xml:space="preserve">Build/test: GCC, GNU Make, Bash (test_cases.sh).</w:t>
+      </w:r>
+    </w:p>
+    <w:p>
+      <w:r>
+        <w:br w:type="page"/>
+      </w:r>
+    </w:p>
+    <w:p>
+      <w:r>
+        <w:rPr>
+          <w:b/>
+        </w:rPr>
+        <w:t>Finalization Addendum - Version 1.1</w:t>
+      </w:r>
+    </w:p>
+    <w:p>
+      <w:r>
+        <w:t>Date: 30 October 2026</w:t>
+      </w:r>
+    </w:p>
+    <w:p>
+      <w:r>
+        <w:t>Status: Final for the current implementation baseline</w:t>
+      </w:r>
+    </w:p>
+    <w:p>
+      <w:r>
+        <w:t>Architecture change assessment: No architectural pattern change was required after implementation. The modular POSIX design described in this document remains the implemented design.</w:t>
+      </w:r>
+    </w:p>
+    <w:p>
+      <w:r>
+        <w:rPr>
+          <w:b/>
+        </w:rPr>
+        <w:t>Final implemented architecture alignment</w:t>
+      </w:r>
+    </w:p>
+    <w:p>
+      <w:r>
+        <w:t>- The parser produces the shared Command representation consumed by the executor.</w:t>
+      </w:r>
+    </w:p>
+    <w:p>
+      <w:r>
+        <w:t>- The executor handles built-ins, fork/exec, pipelines, foreground waiting, and background job tracking.</w:t>
+      </w:r>
+    </w:p>
+    <w:p>
+      <w:r>
+        <w:t>- The redirection manager validates and canonicalizes paths before applying &lt;, &gt;, and &gt;&gt; with dup2.</w:t>
+      </w:r>
+    </w:p>
+    <w:p>
+      <w:r>
+        <w:t>- The environment/PATH resolver handles bare executable lookup and environment expansion.</w:t>
+      </w:r>
+    </w:p>
+    <w:p>
+      <w:r>
+        <w:t>- The REPL performs bounded input handling and reaps completed background jobs between prompts.</w:t>
+      </w:r>
+    </w:p>
+    <w:p>
+      <w:r>
+        <w:rPr>
+          <w:b/>
+        </w:rPr>
+        <w:t>Final verification references</w:t>
+      </w:r>
+    </w:p>
+    <w:p>
+      <w:r>
+        <w:t>The final source/function and test mapping is maintained in docs/rtm_code_references.md. Automated test execution is defined by the Makefile and consists of 12 parser checks, 9 executor checks, and 40 integration checks. Known limitations and manual evidence steps are documented in docs/test_evidence.md.</w:t>
       </w:r>
     </w:p>
     <w:sectPr>

</xml_diff>

<commit_message>
docs: complete SRS and SAD traceability tables
</commit_message>
<xml_diff>
--- a/docs/Simple-Shell_SAD.docx
+++ b/docs/Simple-Shell_SAD.docx
@@ -278,17 +278,7 @@
           </w:tcPr>
           <w:p>
             <w:r>
-              <w:rPr>
-                <w:rFonts w:ascii="Calibri" w:cs="Calibri" w:eastAsia="Calibri" w:hAnsi="Calibri"/>
-                <w:b w:val="false"/>
-                <w:bCs w:val="false"/>
-                <w:i w:val="false"/>
-                <w:iCs w:val="false"/>
-                <w:color w:val="000000"/>
-                <w:sz w:val="20"/>
-                <w:szCs w:val="20"/>
-              </w:rPr>
-              <w:t xml:space="preserve">[Fill Date]</w:t>
+              <w:t>2026-09-30</w:t>
             </w:r>
           </w:p>
         </w:tc>
@@ -341,6 +331,48 @@
                 <w:szCs w:val="20"/>
               </w:rPr>
               <w:t xml:space="preserve">Initial draft</w:t>
+            </w:r>
+          </w:p>
+        </w:tc>
+      </w:tr>
+      <w:tr>
+        <w:tc>
+          <w:tcPr>
+            <w:tcW w:type="dxa" w:w="1800"/>
+          </w:tcPr>
+          <w:p>
+            <w:r>
+              <w:t>1.1</w:t>
+            </w:r>
+          </w:p>
+        </w:tc>
+        <w:tc>
+          <w:tcPr>
+            <w:tcW w:type="dxa" w:w="1500"/>
+          </w:tcPr>
+          <w:p>
+            <w:r>
+              <w:t>2026-10-30</w:t>
+            </w:r>
+          </w:p>
+        </w:tc>
+        <w:tc>
+          <w:tcPr>
+            <w:tcW w:type="dxa" w:w="4000"/>
+          </w:tcPr>
+          <w:p>
+            <w:r>
+              <w:t>Diya</w:t>
+            </w:r>
+          </w:p>
+        </w:tc>
+        <w:tc>
+          <w:tcPr>
+            <w:tcW w:type="dxa" w:w="1200"/>
+          </w:tcPr>
+          <w:p>
+            <w:r>
+              <w:t>Final implementation alignment and verification references</w:t>
             </w:r>
           </w:p>
         </w:tc>
@@ -528,17 +560,7 @@
           </w:tcPr>
           <w:p>
             <w:r>
-              <w:rPr>
-                <w:rFonts w:ascii="Calibri" w:cs="Calibri" w:eastAsia="Calibri" w:hAnsi="Calibri"/>
-                <w:b w:val="false"/>
-                <w:bCs w:val="false"/>
-                <w:i w:val="false"/>
-                <w:iCs w:val="false"/>
-                <w:color w:val="000000"/>
-                <w:sz w:val="20"/>
-                <w:szCs w:val="20"/>
-              </w:rPr>
-              <w:t xml:space="preserve"/>
+              <w:t>2026-10-30</w:t>
             </w:r>
           </w:p>
         </w:tc>
@@ -607,19 +629,7 @@
             </w:tcMar>
           </w:tcPr>
           <w:p>
-            <w:r>
-              <w:rPr>
-                <w:rFonts w:ascii="Calibri" w:cs="Calibri" w:eastAsia="Calibri" w:hAnsi="Calibri"/>
-                <w:b w:val="false"/>
-                <w:bCs w:val="false"/>
-                <w:i w:val="false"/>
-                <w:iCs w:val="false"/>
-                <w:color w:val="000000"/>
-                <w:sz w:val="20"/>
-                <w:szCs w:val="20"/>
-              </w:rPr>
-              <w:t xml:space="preserve"/>
-            </w:r>
+            <w:r/>
           </w:p>
         </w:tc>
       </w:tr>
@@ -687,19 +697,7 @@
             </w:tcMar>
           </w:tcPr>
           <w:p>
-            <w:r>
-              <w:rPr>
-                <w:rFonts w:ascii="Calibri" w:cs="Calibri" w:eastAsia="Calibri" w:hAnsi="Calibri"/>
-                <w:b w:val="false"/>
-                <w:bCs w:val="false"/>
-                <w:i w:val="false"/>
-                <w:iCs w:val="false"/>
-                <w:color w:val="000000"/>
-                <w:sz w:val="20"/>
-                <w:szCs w:val="20"/>
-              </w:rPr>
-              <w:t xml:space="preserve"/>
-            </w:r>
+            <w:r/>
           </w:p>
         </w:tc>
       </w:tr>
@@ -767,19 +765,7 @@
             </w:tcMar>
           </w:tcPr>
           <w:p>
-            <w:r>
-              <w:rPr>
-                <w:rFonts w:ascii="Calibri" w:cs="Calibri" w:eastAsia="Calibri" w:hAnsi="Calibri"/>
-                <w:b w:val="false"/>
-                <w:bCs w:val="false"/>
-                <w:i w:val="false"/>
-                <w:iCs w:val="false"/>
-                <w:color w:val="000000"/>
-                <w:sz w:val="20"/>
-                <w:szCs w:val="20"/>
-              </w:rPr>
-              <w:t xml:space="preserve"/>
-            </w:r>
+            <w:r/>
           </w:p>
         </w:tc>
       </w:tr>

</xml_diff>

<commit_message>
docs: exclude finalized documents from traceability cleanup
</commit_message>
<xml_diff>
--- a/docs/Simple-Shell_SAD.docx
+++ b/docs/Simple-Shell_SAD.docx
@@ -3572,6 +3572,80 @@
           <w:szCs w:val="22"/>
         </w:rPr>
         <w:t xml:space="preserve">Build/test: GCC, GNU Make, Bash (test_cases.sh).</w:t>
+      </w:r>
+    </w:p>
+    <w:p>
+      <w:r>
+        <w:br w:type="page"/>
+      </w:r>
+    </w:p>
+    <w:p>
+      <w:r>
+        <w:rPr>
+          <w:b/>
+        </w:rPr>
+        <w:t>Finalization Addendum - Version 1.1</w:t>
+      </w:r>
+    </w:p>
+    <w:p>
+      <w:r>
+        <w:t>Date: 30 October 2026</w:t>
+      </w:r>
+    </w:p>
+    <w:p>
+      <w:r>
+        <w:t>Status: Final for the current implementation baseline</w:t>
+      </w:r>
+    </w:p>
+    <w:p>
+      <w:r>
+        <w:t>Architecture change assessment: No architectural pattern change was required after implementation. The modular POSIX design described in this document remains the implemented design.</w:t>
+      </w:r>
+    </w:p>
+    <w:p>
+      <w:r>
+        <w:rPr>
+          <w:b/>
+        </w:rPr>
+        <w:t>Final implemented architecture alignment</w:t>
+      </w:r>
+    </w:p>
+    <w:p>
+      <w:r>
+        <w:t>- The parser produces the shared Command representation consumed by the executor.</w:t>
+      </w:r>
+    </w:p>
+    <w:p>
+      <w:r>
+        <w:t>- The executor handles built-ins, fork/exec, pipelines, foreground waiting, and background job tracking.</w:t>
+      </w:r>
+    </w:p>
+    <w:p>
+      <w:r>
+        <w:t>- The redirection manager validates and canonicalizes paths before applying &lt;, &gt;, and &gt;&gt; with dup2.</w:t>
+      </w:r>
+    </w:p>
+    <w:p>
+      <w:r>
+        <w:t>- The environment/PATH resolver handles bare executable lookup and environment expansion.</w:t>
+      </w:r>
+    </w:p>
+    <w:p>
+      <w:r>
+        <w:t>- The REPL performs bounded input handling and reaps completed background jobs between prompts.</w:t>
+      </w:r>
+    </w:p>
+    <w:p>
+      <w:r>
+        <w:rPr>
+          <w:b/>
+        </w:rPr>
+        <w:t>Final verification references</w:t>
+      </w:r>
+    </w:p>
+    <w:p>
+      <w:r>
+        <w:t>The final source/function and test mapping is maintained in docs/rtm_code_references.md. Automated test execution is defined by the Makefile and consists of 12 parser checks, 9 executor checks, and 40 integration checks. Known limitations and manual evidence steps are documented in docs/test_evidence.md.</w:t>
       </w:r>
     </w:p>
     <w:sectPr>

</xml_diff>